<commit_message>
Improve schedule structure and plan extraction
</commit_message>
<xml_diff>
--- a/sale-deed-template.docx
+++ b/sale-deed-template.docx
@@ -994,73 +994,7 @@
           <w:sz w:val="28"/>
           <w:szCs w:val="28"/>
         </w:rPr>
-        <w:t>, Pan:</w:t>
-      </w:r>
-      <w:r>
-        <w:rPr>
-          <w:position w:val="8"/>
-          <w:sz w:val="28"/>
-          <w:szCs w:val="28"/>
-        </w:rPr>
-        <w:t xml:space="preserve"> </w:t>
-      </w:r>
-      <w:r>
-        <w:rPr>
-          <w:position w:val="8"/>
-          <w:sz w:val="28"/>
-          <w:szCs w:val="28"/>
-        </w:rPr>
-        <w:t>&lt;</w:t>
-      </w:r>
-      <w:proofErr w:type="spellStart"/>
-      <w:r>
-        <w:rPr>
-          <w:position w:val="8"/>
-          <w:sz w:val="28"/>
-          <w:szCs w:val="28"/>
-        </w:rPr>
-        <w:t>Executant</w:t>
-      </w:r>
-      <w:proofErr w:type="spellEnd"/>
-      <w:r>
-        <w:rPr>
-          <w:position w:val="8"/>
-          <w:sz w:val="28"/>
-          <w:szCs w:val="28"/>
-        </w:rPr>
-        <w:t xml:space="preserve"> </w:t>
-      </w:r>
-      <w:r>
-        <w:rPr>
-          <w:position w:val="8"/>
-          <w:sz w:val="28"/>
-          <w:szCs w:val="28"/>
-        </w:rPr>
-        <w:t xml:space="preserve">Pan </w:t>
-      </w:r>
-      <w:r>
-        <w:rPr>
-          <w:position w:val="8"/>
-          <w:sz w:val="28"/>
-          <w:szCs w:val="28"/>
-        </w:rPr>
-        <w:t>No.&gt;</w:t>
-      </w:r>
-      <w:r>
-        <w:rPr>
-          <w:position w:val="8"/>
-          <w:sz w:val="28"/>
-          <w:szCs w:val="28"/>
-        </w:rPr>
-        <w:t>.</w:t>
-      </w:r>
-      <w:r>
-        <w:rPr>
-          <w:position w:val="8"/>
-          <w:sz w:val="28"/>
-          <w:szCs w:val="28"/>
-        </w:rPr>
-        <w:t xml:space="preserve"> </w:t>
+        <w:t xml:space="preserve">, </w:t>
       </w:r>
       <w:r>
         <w:rPr>
@@ -1818,7 +1752,7 @@
           <w:sz w:val="28"/>
           <w:szCs w:val="28"/>
         </w:rPr>
-        <w:t xml:space="preserve">Claimant Pan </w:t>
+        <w:t>PAN</w:t>
       </w:r>
       <w:r>
         <w:rPr>
@@ -1826,7 +1760,7 @@
           <w:sz w:val="28"/>
           <w:szCs w:val="28"/>
         </w:rPr>
-        <w:t xml:space="preserve">No.&gt; </w:t>
+        <w:t xml:space="preserve">&gt; </w:t>
       </w:r>
       <w:r>
         <w:rPr>
@@ -2221,7 +2155,23 @@
           <w:sz w:val="28"/>
           <w:szCs w:val="28"/>
         </w:rPr>
-        <w:t>T No.&gt;</w:t>
+        <w:t>T</w:t>
+      </w:r>
+      <w:r>
+        <w:rPr>
+          <w:rStyle w:val="Strong"/>
+          <w:sz w:val="28"/>
+          <w:szCs w:val="28"/>
+        </w:rPr>
+        <w:t>.</w:t>
+      </w:r>
+      <w:r>
+        <w:rPr>
+          <w:rStyle w:val="Strong"/>
+          <w:sz w:val="28"/>
+          <w:szCs w:val="28"/>
+        </w:rPr>
+        <w:t xml:space="preserve"> No.&gt;</w:t>
       </w:r>
       <w:r>
         <w:rPr>
@@ -2794,7 +2744,6 @@
         </w:rPr>
         <w:t>&lt;</w:t>
       </w:r>
-      <w:proofErr w:type="spellStart"/>
       <w:proofErr w:type="gramEnd"/>
       <w:r>
         <w:rPr>
@@ -2810,16 +2759,15 @@
           <w:sz w:val="28"/>
           <w:szCs w:val="28"/>
         </w:rPr>
-        <w:t>No</w:t>
-      </w:r>
-      <w:proofErr w:type="spellEnd"/>
+        <w:t xml:space="preserve"> </w:t>
+      </w:r>
       <w:r>
         <w:rPr>
           <w:rStyle w:val="Strong"/>
           <w:sz w:val="28"/>
           <w:szCs w:val="28"/>
         </w:rPr>
-        <w:t>.&gt;</w:t>
+        <w:t>No.&gt;</w:t>
       </w:r>
       <w:r>
         <w:rPr>
@@ -3371,16 +3319,7 @@
           <w:sz w:val="28"/>
           <w:szCs w:val="28"/>
         </w:rPr>
-        <w:t>Rs</w:t>
-      </w:r>
-      <w:proofErr w:type="gramStart"/>
-      <w:r>
-        <w:rPr>
-          <w:rFonts w:ascii="Times New Roman" w:hAnsi="Times New Roman" w:cs="Times New Roman"/>
-          <w:sz w:val="28"/>
-          <w:szCs w:val="28"/>
-        </w:rPr>
-        <w:t>.</w:t>
+        <w:t>Rs.</w:t>
       </w:r>
       <w:r>
         <w:rPr>
@@ -3390,18 +3329,7 @@
           <w:sz w:val="28"/>
           <w:szCs w:val="28"/>
         </w:rPr>
-        <w:t>&lt;</w:t>
-      </w:r>
-      <w:proofErr w:type="gramEnd"/>
-      <w:r>
-        <w:rPr>
-          <w:rFonts w:ascii="Times New Roman" w:hAnsi="Times New Roman" w:cs="Times New Roman"/>
-          <w:b/>
-          <w:bCs/>
-          <w:sz w:val="28"/>
-          <w:szCs w:val="28"/>
-        </w:rPr>
-        <w:t>Market of Value Rs./-&gt;</w:t>
+        <w:t>&lt;Market of Value Rs./-&gt;</w:t>
       </w:r>
       <w:r>
         <w:rPr>
@@ -3603,15 +3531,7 @@
           <w:sz w:val="28"/>
           <w:szCs w:val="28"/>
         </w:rPr>
-        <w:t xml:space="preserve"> of Rs.&lt;Amount&gt;/-</w:t>
-      </w:r>
-      <w:r>
-        <w:rPr>
-          <w:rFonts w:ascii="Times New Roman" w:hAnsi="Times New Roman" w:cs="Times New Roman"/>
-          <w:sz w:val="28"/>
-          <w:szCs w:val="28"/>
-        </w:rPr>
-        <w:t xml:space="preserve"> paid by the Vendee/s, namely </w:t>
+        <w:t xml:space="preserve"> of Rs.&lt;</w:t>
       </w:r>
       <w:r>
         <w:rPr>
@@ -3622,15 +3542,7 @@
           <w:sz w:val="28"/>
           <w:szCs w:val="28"/>
         </w:rPr>
-        <w:t>&lt;Claimant Name&gt;</w:t>
-      </w:r>
-      <w:r>
-        <w:rPr>
-          <w:rFonts w:ascii="Times New Roman" w:hAnsi="Times New Roman" w:cs="Times New Roman"/>
-          <w:sz w:val="28"/>
-          <w:szCs w:val="28"/>
-        </w:rPr>
-        <w:t xml:space="preserve">, to the Vendor/s, namely </w:t>
+        <w:t xml:space="preserve"> </w:t>
       </w:r>
       <w:r>
         <w:rPr>
@@ -3641,9 +3553,8 @@
           <w:sz w:val="28"/>
           <w:szCs w:val="28"/>
         </w:rPr>
-        <w:t>&lt;</w:t>
-      </w:r>
-      <w:proofErr w:type="spellStart"/>
+        <w:t>Amount</w:t>
+      </w:r>
       <w:r>
         <w:rPr>
           <w:rStyle w:val="Strong"/>
@@ -3653,9 +3564,8 @@
           <w:sz w:val="28"/>
           <w:szCs w:val="28"/>
         </w:rPr>
-        <w:t>Executant</w:t>
-      </w:r>
-      <w:proofErr w:type="spellEnd"/>
+        <w:t xml:space="preserve"> </w:t>
+      </w:r>
       <w:r>
         <w:rPr>
           <w:rStyle w:val="Strong"/>
@@ -3665,15 +3575,15 @@
           <w:sz w:val="28"/>
           <w:szCs w:val="28"/>
         </w:rPr>
-        <w:t xml:space="preserve"> Name&gt;</w:t>
-      </w:r>
-      <w:r>
-        <w:rPr>
-          <w:rFonts w:ascii="Times New Roman" w:hAnsi="Times New Roman" w:cs="Times New Roman"/>
-          <w:sz w:val="28"/>
-          <w:szCs w:val="28"/>
-        </w:rPr>
-        <w:t xml:space="preserve">, through </w:t>
+        <w:t>&gt;/-</w:t>
+      </w:r>
+      <w:r>
+        <w:rPr>
+          <w:rFonts w:ascii="Times New Roman" w:hAnsi="Times New Roman" w:cs="Times New Roman"/>
+          <w:sz w:val="28"/>
+          <w:szCs w:val="28"/>
+        </w:rPr>
+        <w:t xml:space="preserve"> paid by the Vendee/s, namely </w:t>
       </w:r>
       <w:r>
         <w:rPr>
@@ -3684,15 +3594,15 @@
           <w:sz w:val="28"/>
           <w:szCs w:val="28"/>
         </w:rPr>
-        <w:t>RTGS/NEFT</w:t>
-      </w:r>
-      <w:r>
-        <w:rPr>
-          <w:rFonts w:ascii="Times New Roman" w:hAnsi="Times New Roman" w:cs="Times New Roman"/>
-          <w:sz w:val="28"/>
-          <w:szCs w:val="28"/>
-        </w:rPr>
-        <w:t xml:space="preserve">, vide </w:t>
+        <w:t>&lt;Claimant Name&gt;</w:t>
+      </w:r>
+      <w:r>
+        <w:rPr>
+          <w:rFonts w:ascii="Times New Roman" w:hAnsi="Times New Roman" w:cs="Times New Roman"/>
+          <w:sz w:val="28"/>
+          <w:szCs w:val="28"/>
+        </w:rPr>
+        <w:t xml:space="preserve">, to the Vendor/s, namely </w:t>
       </w:r>
       <w:r>
         <w:rPr>
@@ -3703,16 +3613,9 @@
           <w:sz w:val="28"/>
           <w:szCs w:val="28"/>
         </w:rPr>
-        <w:t>Transaction No./UTR No. &lt;UTR No.&gt;</w:t>
-      </w:r>
-      <w:r>
-        <w:rPr>
-          <w:rFonts w:ascii="Times New Roman" w:hAnsi="Times New Roman" w:cs="Times New Roman"/>
-          <w:sz w:val="28"/>
-          <w:szCs w:val="28"/>
-        </w:rPr>
-        <w:t xml:space="preserve">, dated </w:t>
-      </w:r>
+        <w:t>&lt;</w:t>
+      </w:r>
+      <w:proofErr w:type="spellStart"/>
       <w:r>
         <w:rPr>
           <w:rStyle w:val="Strong"/>
@@ -3722,16 +3625,9 @@
           <w:sz w:val="28"/>
           <w:szCs w:val="28"/>
         </w:rPr>
-        <w:t>&lt;Date&gt;</w:t>
-      </w:r>
-      <w:r>
-        <w:rPr>
-          <w:rFonts w:ascii="Times New Roman" w:hAnsi="Times New Roman" w:cs="Times New Roman"/>
-          <w:sz w:val="28"/>
-          <w:szCs w:val="28"/>
-        </w:rPr>
-        <w:t xml:space="preserve">, from </w:t>
-      </w:r>
+        <w:t>Executant</w:t>
+      </w:r>
+      <w:proofErr w:type="spellEnd"/>
       <w:r>
         <w:rPr>
           <w:rStyle w:val="Strong"/>
@@ -3741,7 +3637,175 @@
           <w:sz w:val="28"/>
           <w:szCs w:val="28"/>
         </w:rPr>
-        <w:t>&lt;Bank Name&gt;</w:t>
+        <w:t xml:space="preserve"> Name&gt;</w:t>
+      </w:r>
+      <w:r>
+        <w:rPr>
+          <w:rFonts w:ascii="Times New Roman" w:hAnsi="Times New Roman" w:cs="Times New Roman"/>
+          <w:sz w:val="28"/>
+          <w:szCs w:val="28"/>
+        </w:rPr>
+        <w:t xml:space="preserve">, through </w:t>
+      </w:r>
+      <w:r>
+        <w:rPr>
+          <w:rStyle w:val="Strong"/>
+          <w:rFonts w:ascii="Times New Roman" w:hAnsi="Times New Roman" w:cs="Times New Roman"/>
+          <w:b w:val="0"/>
+          <w:bCs w:val="0"/>
+          <w:sz w:val="28"/>
+          <w:szCs w:val="28"/>
+        </w:rPr>
+        <w:t>RTGS/NEFT</w:t>
+      </w:r>
+      <w:r>
+        <w:rPr>
+          <w:rFonts w:ascii="Times New Roman" w:hAnsi="Times New Roman" w:cs="Times New Roman"/>
+          <w:sz w:val="28"/>
+          <w:szCs w:val="28"/>
+        </w:rPr>
+        <w:t xml:space="preserve">, vide </w:t>
+      </w:r>
+      <w:r>
+        <w:rPr>
+          <w:rStyle w:val="Strong"/>
+          <w:rFonts w:ascii="Times New Roman" w:hAnsi="Times New Roman" w:cs="Times New Roman"/>
+          <w:b w:val="0"/>
+          <w:bCs w:val="0"/>
+          <w:sz w:val="28"/>
+          <w:szCs w:val="28"/>
+        </w:rPr>
+        <w:t>Transaction No.</w:t>
+      </w:r>
+      <w:r>
+        <w:rPr>
+          <w:rStyle w:val="Strong"/>
+          <w:rFonts w:ascii="Times New Roman" w:hAnsi="Times New Roman" w:cs="Times New Roman"/>
+          <w:b w:val="0"/>
+          <w:bCs w:val="0"/>
+          <w:sz w:val="28"/>
+          <w:szCs w:val="28"/>
+        </w:rPr>
+        <w:t>/</w:t>
+      </w:r>
+      <w:r>
+        <w:rPr>
+          <w:rStyle w:val="Strong"/>
+          <w:rFonts w:ascii="Times New Roman" w:hAnsi="Times New Roman" w:cs="Times New Roman"/>
+          <w:b w:val="0"/>
+          <w:bCs w:val="0"/>
+          <w:sz w:val="28"/>
+          <w:szCs w:val="28"/>
+        </w:rPr>
+        <w:t>UTR No. &lt;</w:t>
+      </w:r>
+      <w:proofErr w:type="spellStart"/>
+      <w:r>
+        <w:rPr>
+          <w:rFonts w:ascii="Times New Roman" w:hAnsi="Times New Roman" w:cs="Times New Roman"/>
+          <w:sz w:val="28"/>
+          <w:szCs w:val="28"/>
+        </w:rPr>
+        <w:t>Utr</w:t>
+      </w:r>
+      <w:proofErr w:type="spellEnd"/>
+      <w:r>
+        <w:rPr>
+          <w:rFonts w:ascii="Times New Roman" w:hAnsi="Times New Roman" w:cs="Times New Roman"/>
+          <w:sz w:val="28"/>
+          <w:szCs w:val="28"/>
+        </w:rPr>
+        <w:t>/Reference No</w:t>
+      </w:r>
+      <w:r>
+        <w:rPr>
+          <w:rFonts w:ascii="Times New Roman" w:hAnsi="Times New Roman" w:cs="Times New Roman"/>
+          <w:sz w:val="28"/>
+          <w:szCs w:val="28"/>
+        </w:rPr>
+        <w:t>.</w:t>
+      </w:r>
+      <w:r>
+        <w:rPr>
+          <w:rStyle w:val="Strong"/>
+          <w:rFonts w:ascii="Times New Roman" w:hAnsi="Times New Roman" w:cs="Times New Roman"/>
+          <w:b w:val="0"/>
+          <w:bCs w:val="0"/>
+          <w:sz w:val="28"/>
+          <w:szCs w:val="28"/>
+        </w:rPr>
+        <w:t>&gt;</w:t>
+      </w:r>
+      <w:r>
+        <w:rPr>
+          <w:rFonts w:ascii="Times New Roman" w:hAnsi="Times New Roman" w:cs="Times New Roman"/>
+          <w:sz w:val="28"/>
+          <w:szCs w:val="28"/>
+        </w:rPr>
+        <w:t xml:space="preserve">, dated </w:t>
+      </w:r>
+      <w:r>
+        <w:rPr>
+          <w:rStyle w:val="Strong"/>
+          <w:rFonts w:ascii="Times New Roman" w:hAnsi="Times New Roman" w:cs="Times New Roman"/>
+          <w:b w:val="0"/>
+          <w:bCs w:val="0"/>
+          <w:sz w:val="28"/>
+          <w:szCs w:val="28"/>
+        </w:rPr>
+        <w:t>&lt;Date&gt;</w:t>
+      </w:r>
+      <w:r>
+        <w:rPr>
+          <w:rFonts w:ascii="Times New Roman" w:hAnsi="Times New Roman" w:cs="Times New Roman"/>
+          <w:sz w:val="28"/>
+          <w:szCs w:val="28"/>
+        </w:rPr>
+        <w:t xml:space="preserve">, from </w:t>
+      </w:r>
+      <w:r>
+        <w:rPr>
+          <w:rStyle w:val="Strong"/>
+          <w:rFonts w:ascii="Times New Roman" w:hAnsi="Times New Roman" w:cs="Times New Roman"/>
+          <w:b w:val="0"/>
+          <w:bCs w:val="0"/>
+          <w:sz w:val="28"/>
+          <w:szCs w:val="28"/>
+        </w:rPr>
+        <w:t>&lt;</w:t>
+      </w:r>
+      <w:r>
+        <w:rPr>
+          <w:rStyle w:val="Strong"/>
+          <w:rFonts w:ascii="Times New Roman" w:hAnsi="Times New Roman" w:cs="Times New Roman"/>
+          <w:b w:val="0"/>
+          <w:bCs w:val="0"/>
+          <w:sz w:val="28"/>
+          <w:szCs w:val="28"/>
+        </w:rPr>
+        <w:t xml:space="preserve">Remitting </w:t>
+      </w:r>
+      <w:r>
+        <w:rPr>
+          <w:rStyle w:val="Strong"/>
+          <w:rFonts w:ascii="Times New Roman" w:hAnsi="Times New Roman" w:cs="Times New Roman"/>
+          <w:b w:val="0"/>
+          <w:bCs w:val="0"/>
+          <w:sz w:val="28"/>
+          <w:szCs w:val="28"/>
+        </w:rPr>
+        <w:t>Bank</w:t>
+      </w:r>
+      <w:r>
+        <w:rPr>
+          <w:rStyle w:val="Strong"/>
+          <w:rFonts w:ascii="Times New Roman" w:hAnsi="Times New Roman" w:cs="Times New Roman"/>
+          <w:b w:val="0"/>
+          <w:bCs w:val="0"/>
+          <w:sz w:val="28"/>
+          <w:szCs w:val="28"/>
+        </w:rPr>
+        <w:t>&gt;</w:t>
       </w:r>
       <w:r>
         <w:rPr>
@@ -4530,7 +4594,7 @@
           <w:sz w:val="28"/>
           <w:szCs w:val="28"/>
         </w:rPr>
-        <w:t>, and the Vendor/s hereby acknowledge the receipt of the said amount.</w:t>
+        <w:t>.</w:t>
       </w:r>
     </w:p>
     <w:p>
@@ -4591,6 +4655,20 @@
         </w:rPr>
         <w:t>from any further liability or demand in respect thereof.</w:t>
       </w:r>
+    </w:p>
+    <w:p>
+      <w:pPr>
+        <w:spacing w:before="100" w:beforeAutospacing="1" w:after="100" w:afterAutospacing="1" w:line="252" w:lineRule="auto"/>
+        <w:ind w:firstLine="720"/>
+        <w:jc w:val="both"/>
+        <w:outlineLvl w:val="0"/>
+        <w:rPr>
+          <w:rFonts w:ascii="Times New Roman" w:hAnsi="Times New Roman" w:cs="Times New Roman"/>
+          <w:bCs/>
+          <w:sz w:val="28"/>
+          <w:szCs w:val="28"/>
+        </w:rPr>
+      </w:pPr>
     </w:p>
     <w:p>
       <w:pPr>
@@ -16679,7 +16757,7 @@
                 <w:b/>
                 <w:noProof/>
               </w:rPr>
-              <w:t>2</w:t>
+              <w:t>4</w:t>
             </w:r>
             <w:r>
               <w:rPr>

</xml_diff>

<commit_message>
Refine manual deed generation flow
</commit_message>
<xml_diff>
--- a/sale-deed-template.docx
+++ b/sale-deed-template.docx
@@ -1939,92 +1939,54 @@
       </w:pPr>
       <w:r>
         <w:rPr>
-          <w:rStyle w:val="Strong"/>
-          <w:sz w:val="28"/>
-          <w:szCs w:val="28"/>
-        </w:rPr>
-        <w:t>Registered Deed:</w:t>
-      </w:r>
-      <w:r>
-        <w:rPr>
-          <w:sz w:val="28"/>
-          <w:szCs w:val="28"/>
-        </w:rPr>
-        <w:t xml:space="preserve"> The Vendor/s derived title, right, and interest in respect of the Schedule Property under and by virtue of the Registered &lt;Link Doc Type&gt; dated &lt;Link </w:t>
-      </w:r>
-      <w:proofErr w:type="spellStart"/>
-      <w:r>
-        <w:rPr>
-          <w:sz w:val="28"/>
-          <w:szCs w:val="28"/>
-        </w:rPr>
-        <w:t>Doct.Date</w:t>
-      </w:r>
-      <w:proofErr w:type="spellEnd"/>
-      <w:r>
-        <w:rPr>
-          <w:sz w:val="28"/>
-          <w:szCs w:val="28"/>
-        </w:rPr>
-        <w:t xml:space="preserve">&gt;, registered as </w:t>
-      </w:r>
-      <w:r>
-        <w:rPr>
-          <w:rStyle w:val="Strong"/>
-          <w:b w:val="0"/>
-          <w:bCs w:val="0"/>
-          <w:sz w:val="28"/>
-          <w:szCs w:val="28"/>
-        </w:rPr>
-        <w:t>Document No.</w:t>
-      </w:r>
-      <w:r>
-        <w:rPr>
-          <w:rStyle w:val="Strong"/>
-          <w:sz w:val="28"/>
-          <w:szCs w:val="28"/>
-        </w:rPr>
-        <w:t xml:space="preserve">&lt;Link </w:t>
-      </w:r>
-      <w:proofErr w:type="spellStart"/>
-      <w:r>
-        <w:rPr>
-          <w:rStyle w:val="Strong"/>
-          <w:sz w:val="28"/>
-          <w:szCs w:val="28"/>
-        </w:rPr>
-        <w:t>Doct.No</w:t>
-      </w:r>
-      <w:proofErr w:type="spellEnd"/>
-      <w:r>
-        <w:rPr>
-          <w:rStyle w:val="Strong"/>
-          <w:sz w:val="28"/>
-          <w:szCs w:val="28"/>
-        </w:rPr>
-        <w:t>.&gt;</w:t>
-      </w:r>
-      <w:r>
-        <w:rPr>
-          <w:sz w:val="28"/>
-          <w:szCs w:val="28"/>
-        </w:rPr>
+          <w:b/>
+        </w:rPr>
+        <w:t xml:space="preserve">Registered Deed: The title, right, and interest in respect of the Schedule Property were derived under and by virtue of the Registered </w:t>
+      </w:r>
+      <w:r>
+        <w:rPr>
+          <w:b/>
+        </w:rPr>
+        <w:t xml:space="preserve">&lt;Link Doc Type&gt;</w:t>
+      </w:r>
+      <w:r>
+        <w:t xml:space="preserve"> dated </w:t>
+      </w:r>
+      <w:r>
+        <w:rPr>
+          <w:b/>
+        </w:rPr>
+        <w:t xml:space="preserve">&lt;Link Doct.Date&gt;</w:t>
+      </w:r>
+      <w:r>
+        <w:t xml:space="preserve">, registered as Document No. </w:t>
+      </w:r>
+      <w:r>
+        <w:rPr>
+          <w:b/>
+        </w:rPr>
+        <w:t xml:space="preserve">&lt;Link Doct.No.&gt;</w:t>
+      </w:r>
+      <w:r>
         <w:t xml:space="preserve"> in the office of the Sub-Registrar, </w:t>
       </w:r>
       <w:r>
         <w:rPr>
-          <w:rStyle w:val="Strong"/>
-          <w:sz w:val="28"/>
-          <w:szCs w:val="28"/>
-        </w:rPr>
-        <w:t>&lt;Sub Registrar&gt; (&lt;Sub Registrar Code&gt;)</w:t>
-      </w:r>
-      <w:r>
-        <w:rPr>
-          <w:sz w:val="28"/>
-          <w:szCs w:val="28"/>
-        </w:rPr>
-        <w:t>.</w:t>
+          <w:b/>
+        </w:rPr>
+        <w:t xml:space="preserve">&lt;Sub Registrar&gt;</w:t>
+      </w:r>
+      <w:r>
+        <w:t xml:space="preserve"> (</w:t>
+      </w:r>
+      <w:r>
+        <w:rPr>
+          <w:b/>
+        </w:rPr>
+        <w:t xml:space="preserve">&lt;Sub Registrar Code&gt;</w:t>
+      </w:r>
+      <w:r>
+        <w:t xml:space="preserve">).</w:t>
       </w:r>
     </w:p>
     <w:p>
@@ -2044,141 +2006,18 @@
       </w:pPr>
       <w:r>
         <w:rPr>
-          <w:rStyle w:val="Strong"/>
-          <w:sz w:val="28"/>
-          <w:szCs w:val="28"/>
-        </w:rPr>
-        <w:t>Vacant Land Tax/Assessment</w:t>
-      </w:r>
-      <w:r>
-        <w:rPr>
-          <w:rStyle w:val="Strong"/>
-          <w:b w:val="0"/>
-          <w:bCs w:val="0"/>
-          <w:sz w:val="28"/>
-          <w:szCs w:val="28"/>
-        </w:rPr>
-        <w:t>:</w:t>
-      </w:r>
-      <w:r>
-        <w:rPr>
-          <w:sz w:val="28"/>
-          <w:szCs w:val="28"/>
-        </w:rPr>
-        <w:t xml:space="preserve"> The Schedule Property is also covered by </w:t>
-      </w:r>
-      <w:r>
-        <w:rPr>
-          <w:rStyle w:val="Strong"/>
-          <w:b w:val="0"/>
-          <w:bCs w:val="0"/>
-          <w:sz w:val="28"/>
-          <w:szCs w:val="28"/>
-        </w:rPr>
-        <w:t>Vacant Land Tax No</w:t>
-      </w:r>
-      <w:proofErr w:type="gramStart"/>
-      <w:r>
-        <w:rPr>
-          <w:rStyle w:val="Strong"/>
-          <w:b w:val="0"/>
-          <w:bCs w:val="0"/>
-          <w:sz w:val="28"/>
-          <w:szCs w:val="28"/>
-        </w:rPr>
-        <w:t>./</w:t>
-      </w:r>
-      <w:proofErr w:type="gramEnd"/>
-      <w:r>
-        <w:rPr>
-          <w:rStyle w:val="Strong"/>
-          <w:b w:val="0"/>
-          <w:bCs w:val="0"/>
-          <w:sz w:val="28"/>
-          <w:szCs w:val="28"/>
-        </w:rPr>
-        <w:t>Assessment No.</w:t>
-      </w:r>
-      <w:r>
-        <w:rPr>
-          <w:rStyle w:val="Strong"/>
-          <w:b w:val="0"/>
-          <w:bCs w:val="0"/>
-          <w:sz w:val="28"/>
-          <w:szCs w:val="28"/>
-        </w:rPr>
-        <w:t xml:space="preserve"> </w:t>
-      </w:r>
-      <w:r>
-        <w:rPr>
-          <w:rStyle w:val="Strong"/>
-          <w:sz w:val="28"/>
-          <w:szCs w:val="28"/>
-        </w:rPr>
-        <w:t>&lt;</w:t>
-      </w:r>
-      <w:r>
-        <w:rPr>
-          <w:rStyle w:val="Strong"/>
-          <w:sz w:val="28"/>
-          <w:szCs w:val="28"/>
-        </w:rPr>
-        <w:t>V</w:t>
-      </w:r>
-      <w:r>
-        <w:rPr>
-          <w:rStyle w:val="Strong"/>
-          <w:sz w:val="28"/>
-          <w:szCs w:val="28"/>
-        </w:rPr>
-        <w:t>.</w:t>
-      </w:r>
-      <w:r>
-        <w:rPr>
-          <w:rStyle w:val="Strong"/>
-          <w:sz w:val="28"/>
-          <w:szCs w:val="28"/>
-        </w:rPr>
-        <w:t>L</w:t>
-      </w:r>
-      <w:r>
-        <w:rPr>
-          <w:rStyle w:val="Strong"/>
-          <w:sz w:val="28"/>
-          <w:szCs w:val="28"/>
-        </w:rPr>
-        <w:t>.</w:t>
-      </w:r>
-      <w:r>
-        <w:rPr>
-          <w:rStyle w:val="Strong"/>
-          <w:sz w:val="28"/>
-          <w:szCs w:val="28"/>
-        </w:rPr>
-        <w:t>T</w:t>
-      </w:r>
-      <w:r>
-        <w:rPr>
-          <w:rStyle w:val="Strong"/>
-          <w:sz w:val="28"/>
-          <w:szCs w:val="28"/>
-        </w:rPr>
-        <w:t>.</w:t>
-      </w:r>
-      <w:r>
-        <w:rPr>
-          <w:rStyle w:val="Strong"/>
-          <w:sz w:val="28"/>
-          <w:szCs w:val="28"/>
-        </w:rPr>
-        <w:t xml:space="preserve"> No.&gt;</w:t>
-      </w:r>
-      <w:r>
-        <w:rPr>
-          <w:sz w:val="28"/>
-          <w:szCs w:val="28"/>
-        </w:rPr>
-        <w:t>, standing in respect of the said property.</w:t>
+          <w:b/>
+        </w:rPr>
+        <w:t xml:space="preserve">Vacant Land Tax/Assessment: The Schedule Property is also covered by Vacant Land Tax No./Assessment No. </w:t>
+      </w:r>
+      <w:r>
+        <w:rPr>
+          <w:b/>
+        </w:rPr>
+        <w:t xml:space="preserve">&lt;V.L.T. No.&gt;</w:t>
+      </w:r>
+      <w:r>
+        <w:t xml:space="preserve"> standing in respect of the said property.</w:t>
       </w:r>
     </w:p>
     <w:p>
@@ -2198,73 +2037,18 @@
       </w:pPr>
       <w:r>
         <w:rPr>
-          <w:rStyle w:val="Strong"/>
-          <w:sz w:val="28"/>
-          <w:szCs w:val="28"/>
-        </w:rPr>
-        <w:t>Approved Layout</w:t>
-      </w:r>
-      <w:r>
-        <w:rPr>
-          <w:rStyle w:val="Strong"/>
-          <w:b w:val="0"/>
-          <w:bCs w:val="0"/>
-          <w:sz w:val="28"/>
-          <w:szCs w:val="28"/>
-        </w:rPr>
-        <w:t>:</w:t>
-      </w:r>
-      <w:r>
-        <w:rPr>
-          <w:sz w:val="28"/>
-          <w:szCs w:val="28"/>
-        </w:rPr>
-        <w:t xml:space="preserve"> The Schedule Property forms part of the layout covered by </w:t>
-      </w:r>
-      <w:r>
-        <w:rPr>
-          <w:rStyle w:val="Strong"/>
-          <w:b w:val="0"/>
-          <w:bCs w:val="0"/>
-          <w:sz w:val="28"/>
-          <w:szCs w:val="28"/>
-        </w:rPr>
-        <w:t>Approved Layout File No</w:t>
-      </w:r>
-      <w:proofErr w:type="gramStart"/>
-      <w:r>
-        <w:rPr>
-          <w:rStyle w:val="Strong"/>
-          <w:b w:val="0"/>
-          <w:bCs w:val="0"/>
-          <w:sz w:val="28"/>
-          <w:szCs w:val="28"/>
-        </w:rPr>
-        <w:t>.</w:t>
-      </w:r>
-      <w:r>
-        <w:rPr>
-          <w:rStyle w:val="Strong"/>
-          <w:sz w:val="28"/>
-          <w:szCs w:val="28"/>
-        </w:rPr>
-        <w:t>&lt;</w:t>
-      </w:r>
-      <w:proofErr w:type="gramEnd"/>
-      <w:r>
-        <w:rPr>
-          <w:rStyle w:val="Strong"/>
-          <w:sz w:val="28"/>
-          <w:szCs w:val="28"/>
-        </w:rPr>
-        <w:t>Layout File No.&gt;</w:t>
-      </w:r>
-      <w:r>
-        <w:rPr>
-          <w:sz w:val="28"/>
-          <w:szCs w:val="28"/>
-        </w:rPr>
-        <w:t>, duly approved by the competent authority, in accordance with the applicable laws, rules, and regulations.</w:t>
+          <w:b/>
+        </w:rPr>
+        <w:t xml:space="preserve">Approved Layout: The Schedule Property forms part of the layout covered by Approved Layout File No. </w:t>
+      </w:r>
+      <w:r>
+        <w:rPr>
+          <w:b/>
+        </w:rPr>
+        <w:t xml:space="preserve">&lt;Layout File No.&gt;</w:t>
+      </w:r>
+      <w:r>
+        <w:t xml:space="preserve">, duly approved by the competent authority, in accordance with the applicable laws, rules, and regulations.</w:t>
       </w:r>
     </w:p>
     <w:p>
@@ -2285,131 +2069,26 @@
       <w:r>
         <w:rPr>
           <w:b/>
-          <w:bCs/>
-          <w:sz w:val="28"/>
-          <w:szCs w:val="28"/>
-        </w:rPr>
-        <w:t xml:space="preserve">Title Deed: </w:t>
-      </w:r>
-      <w:r>
-        <w:rPr>
-          <w:sz w:val="28"/>
-          <w:szCs w:val="28"/>
-        </w:rPr>
-        <w:t>The Vendor/s is/are the lawful owner/s and peaceful possessor/s of the Schedule Property by virtue of Title Deed No</w:t>
-      </w:r>
-      <w:proofErr w:type="gramStart"/>
-      <w:r>
-        <w:rPr>
-          <w:sz w:val="28"/>
-          <w:szCs w:val="28"/>
-        </w:rPr>
-        <w:t>.</w:t>
+        </w:rPr>
+        <w:t xml:space="preserve">Title Deed: The title, right, and interest in respect of the Schedule Property are covered by Title Deed No. </w:t>
       </w:r>
       <w:r>
         <w:rPr>
           <w:b/>
-          <w:bCs/>
-          <w:sz w:val="28"/>
-          <w:szCs w:val="28"/>
-        </w:rPr>
-        <w:t>&lt;</w:t>
-      </w:r>
-      <w:proofErr w:type="spellStart"/>
-      <w:proofErr w:type="gramEnd"/>
+        </w:rPr>
+        <w:t xml:space="preserve">&lt;Pattadar Pass Book No&gt;</w:t>
+      </w:r>
+      <w:r>
+        <w:t xml:space="preserve">, duly executed and registered in respect of the Schedule Property, and the ownership/title of the concerned parties has been duly recognized and recorded in the revenue records under Khata No. </w:t>
+      </w:r>
       <w:r>
         <w:rPr>
           <w:b/>
-          <w:bCs/>
-          <w:sz w:val="28"/>
-          <w:szCs w:val="28"/>
-        </w:rPr>
-        <w:t>Pattadar</w:t>
-      </w:r>
-      <w:proofErr w:type="spellEnd"/>
-      <w:r>
-        <w:rPr>
-          <w:b/>
-          <w:bCs/>
-          <w:sz w:val="28"/>
-          <w:szCs w:val="28"/>
-        </w:rPr>
-        <w:t xml:space="preserve"> Pass Book No&gt;</w:t>
-      </w:r>
-      <w:r>
-        <w:rPr>
-          <w:sz w:val="28"/>
-          <w:szCs w:val="28"/>
-        </w:rPr>
-        <w:t xml:space="preserve">, duly executed and registered in his/her/their </w:t>
-      </w:r>
-      <w:proofErr w:type="spellStart"/>
-      <w:r>
-        <w:rPr>
-          <w:sz w:val="28"/>
-          <w:szCs w:val="28"/>
-        </w:rPr>
-        <w:t>favour</w:t>
-      </w:r>
-      <w:proofErr w:type="spellEnd"/>
-      <w:r>
-        <w:rPr>
-          <w:sz w:val="28"/>
-          <w:szCs w:val="28"/>
-        </w:rPr>
-        <w:t xml:space="preserve">, and the ownership of the Vendor/s has been duly recognized and recorded in the revenue records under </w:t>
-      </w:r>
-      <w:proofErr w:type="spellStart"/>
-      <w:r>
-        <w:rPr>
-          <w:sz w:val="28"/>
-          <w:szCs w:val="28"/>
-        </w:rPr>
-        <w:t>Khata</w:t>
-      </w:r>
-      <w:proofErr w:type="spellEnd"/>
-      <w:r>
-        <w:rPr>
-          <w:sz w:val="28"/>
-          <w:szCs w:val="28"/>
-        </w:rPr>
-        <w:t xml:space="preserve"> No.</w:t>
-      </w:r>
-      <w:r>
-        <w:rPr>
-          <w:b/>
-          <w:bCs/>
-          <w:sz w:val="28"/>
-          <w:szCs w:val="28"/>
-        </w:rPr>
-        <w:t xml:space="preserve">&lt;Pass Book </w:t>
-      </w:r>
-      <w:proofErr w:type="spellStart"/>
-      <w:r>
-        <w:rPr>
-          <w:b/>
-          <w:bCs/>
-          <w:sz w:val="28"/>
-          <w:szCs w:val="28"/>
-        </w:rPr>
-        <w:t>Khata</w:t>
-      </w:r>
-      <w:proofErr w:type="spellEnd"/>
-      <w:r>
-        <w:rPr>
-          <w:b/>
-          <w:bCs/>
-          <w:sz w:val="28"/>
-          <w:szCs w:val="28"/>
-        </w:rPr>
-        <w:t xml:space="preserve"> No&gt;</w:t>
-      </w:r>
-      <w:r>
-        <w:rPr>
-          <w:sz w:val="28"/>
-          <w:szCs w:val="28"/>
-        </w:rPr>
-        <w:t>.</w:t>
+        </w:rPr>
+        <w:t xml:space="preserve">&lt;Pass Book Khata No&gt;</w:t>
+      </w:r>
+      <w:r>
+        <w:t xml:space="preserve">.</w:t>
       </w:r>
     </w:p>
     <w:p>
@@ -2427,100 +2106,29 @@
           <w:szCs w:val="28"/>
         </w:rPr>
       </w:pPr>
-      <w:proofErr w:type="spellStart"/>
       <w:r>
         <w:rPr>
           <w:b/>
-          <w:bCs/>
-          <w:sz w:val="28"/>
-          <w:szCs w:val="28"/>
-        </w:rPr>
-        <w:t>Nala</w:t>
-      </w:r>
-      <w:proofErr w:type="spellEnd"/>
+        </w:rPr>
+        <w:t xml:space="preserve">Nala Order: The Schedule Property has been duly converted from agricultural use to non-agricultural/residential use by virtue of Nala Order No. </w:t>
+      </w:r>
       <w:r>
         <w:rPr>
           <w:b/>
-          <w:bCs/>
-          <w:sz w:val="28"/>
-          <w:szCs w:val="28"/>
-        </w:rPr>
-        <w:t xml:space="preserve"> Order:</w:t>
-      </w:r>
-      <w:r>
-        <w:rPr>
-          <w:sz w:val="28"/>
-          <w:szCs w:val="28"/>
-        </w:rPr>
-        <w:t xml:space="preserve"> The Schedule Property has been duly converted from agricultural use to non-agricultural/residential use by virtue of </w:t>
-      </w:r>
-      <w:proofErr w:type="spellStart"/>
-      <w:r>
-        <w:rPr>
-          <w:sz w:val="28"/>
-          <w:szCs w:val="28"/>
-        </w:rPr>
-        <w:t>Nala</w:t>
-      </w:r>
-      <w:proofErr w:type="spellEnd"/>
-      <w:r>
-        <w:rPr>
-          <w:sz w:val="28"/>
-          <w:szCs w:val="28"/>
-        </w:rPr>
-        <w:t xml:space="preserve"> Order No.</w:t>
+        </w:rPr>
+        <w:t xml:space="preserve">&lt;Nala Order No&gt;</w:t>
+      </w:r>
+      <w:r>
+        <w:t xml:space="preserve">, dated </w:t>
       </w:r>
       <w:r>
         <w:rPr>
           <w:b/>
-          <w:bCs/>
-          <w:sz w:val="28"/>
-          <w:szCs w:val="28"/>
-        </w:rPr>
-        <w:t>&lt;</w:t>
-      </w:r>
-      <w:proofErr w:type="spellStart"/>
-      <w:r>
-        <w:rPr>
-          <w:b/>
-          <w:bCs/>
-          <w:sz w:val="28"/>
-          <w:szCs w:val="28"/>
-        </w:rPr>
-        <w:t>Nala</w:t>
-      </w:r>
-      <w:proofErr w:type="spellEnd"/>
-      <w:r>
-        <w:rPr>
-          <w:b/>
-          <w:bCs/>
-          <w:sz w:val="28"/>
-          <w:szCs w:val="28"/>
-        </w:rPr>
-        <w:t xml:space="preserve"> Order No&gt;, </w:t>
-      </w:r>
-      <w:r>
-        <w:rPr>
-          <w:sz w:val="28"/>
-          <w:szCs w:val="28"/>
-        </w:rPr>
-        <w:t xml:space="preserve">dated:&lt;Link </w:t>
-      </w:r>
-      <w:proofErr w:type="spellStart"/>
-      <w:r>
-        <w:rPr>
-          <w:sz w:val="28"/>
-          <w:szCs w:val="28"/>
-        </w:rPr>
-        <w:t>Doct.Date</w:t>
-      </w:r>
-      <w:proofErr w:type="spellEnd"/>
-      <w:r>
-        <w:rPr>
-          <w:sz w:val="28"/>
-          <w:szCs w:val="28"/>
-        </w:rPr>
-        <w:t>&gt;, and all requisite statutory permissions, sanctions, approvals, and proceedings relating to such conversion have been duly obtained and complied with.</w:t>
+        </w:rPr>
+        <w:t xml:space="preserve">&lt;Link Doct.Date&gt;</w:t>
+      </w:r>
+      <w:r>
+        <w:t xml:space="preserve">, and all requisite statutory permissions, sanctions, approvals, and proceedings relating to such conversion have been duly obtained and complied with.</w:t>
       </w:r>
     </w:p>
     <w:p>
@@ -2544,134 +2152,36 @@
       </w:pPr>
       <w:r>
         <w:rPr>
-          <w:rStyle w:val="Strong"/>
-          <w:rFonts w:ascii="Times New Roman" w:hAnsi="Times New Roman" w:cs="Times New Roman"/>
-          <w:sz w:val="28"/>
-          <w:szCs w:val="28"/>
-        </w:rPr>
-        <w:t>Property Tax:</w:t>
-      </w:r>
-      <w:r>
-        <w:rPr>
-          <w:rFonts w:ascii="Times New Roman" w:hAnsi="Times New Roman" w:cs="Times New Roman"/>
-          <w:sz w:val="28"/>
-          <w:szCs w:val="28"/>
-        </w:rPr>
-        <w:t xml:space="preserve"> The Schedule Property is covered by p</w:t>
-      </w:r>
-      <w:r>
-        <w:rPr>
-          <w:rStyle w:val="Strong"/>
-          <w:rFonts w:ascii="Times New Roman" w:hAnsi="Times New Roman" w:cs="Times New Roman"/>
-          <w:b w:val="0"/>
-          <w:bCs w:val="0"/>
-          <w:sz w:val="28"/>
-          <w:szCs w:val="28"/>
-        </w:rPr>
-        <w:t>roperty Tax receipt No</w:t>
-      </w:r>
-      <w:proofErr w:type="gramStart"/>
-      <w:r>
-        <w:rPr>
-          <w:rStyle w:val="Strong"/>
-          <w:rFonts w:ascii="Times New Roman" w:hAnsi="Times New Roman" w:cs="Times New Roman"/>
-          <w:b w:val="0"/>
-          <w:bCs w:val="0"/>
-          <w:sz w:val="28"/>
-          <w:szCs w:val="28"/>
-        </w:rPr>
-        <w:t>.</w:t>
-      </w:r>
-      <w:r>
-        <w:rPr>
-          <w:rFonts w:ascii="Times New Roman" w:hAnsi="Times New Roman" w:cs="Times New Roman"/>
           <w:b/>
-          <w:bCs/>
-          <w:sz w:val="28"/>
-          <w:szCs w:val="32"/>
-        </w:rPr>
-        <w:t>&lt;</w:t>
-      </w:r>
-      <w:proofErr w:type="gramEnd"/>
-      <w:r>
-        <w:rPr>
-          <w:rFonts w:ascii="Times New Roman" w:hAnsi="Times New Roman" w:cs="Times New Roman"/>
+        </w:rPr>
+        <w:t xml:space="preserve">Property Tax: The Schedule Property is covered by Property Tax Receipt No. </w:t>
+      </w:r>
+      <w:r>
+        <w:rPr>
           <w:b/>
-          <w:bCs/>
-          <w:sz w:val="28"/>
-          <w:szCs w:val="28"/>
-        </w:rPr>
-        <w:t>House Tax Receipt&gt;</w:t>
-      </w:r>
-      <w:r>
-        <w:rPr>
-          <w:rFonts w:ascii="Times New Roman" w:hAnsi="Times New Roman" w:cs="Times New Roman"/>
+        </w:rPr>
+        <w:t xml:space="preserve">&lt;House Tax Receipt&gt;</w:t>
+      </w:r>
+      <w:r>
+        <w:t xml:space="preserve">, dated </w:t>
+      </w:r>
+      <w:r>
+        <w:rPr>
           <w:b/>
-          <w:bCs/>
-          <w:sz w:val="28"/>
-          <w:szCs w:val="32"/>
-        </w:rPr>
-        <w:t xml:space="preserve">, </w:t>
-      </w:r>
-      <w:r>
-        <w:rPr>
-          <w:rFonts w:ascii="Times New Roman" w:hAnsi="Times New Roman" w:cs="Times New Roman"/>
-          <w:sz w:val="28"/>
-          <w:szCs w:val="28"/>
-        </w:rPr>
-        <w:t xml:space="preserve">dated:&lt;Link </w:t>
-      </w:r>
-      <w:proofErr w:type="spellStart"/>
-      <w:r>
-        <w:rPr>
-          <w:rFonts w:ascii="Times New Roman" w:hAnsi="Times New Roman" w:cs="Times New Roman"/>
-          <w:sz w:val="28"/>
-          <w:szCs w:val="28"/>
-        </w:rPr>
-        <w:t>Doct.Date</w:t>
-      </w:r>
-      <w:proofErr w:type="spellEnd"/>
-      <w:r>
-        <w:rPr>
-          <w:rFonts w:ascii="Times New Roman" w:hAnsi="Times New Roman" w:cs="Times New Roman"/>
-          <w:sz w:val="28"/>
-          <w:szCs w:val="28"/>
-        </w:rPr>
-        <w:t>&gt; issued by the concerned Local Authority</w:t>
-      </w:r>
-      <w:r>
-        <w:rPr>
-          <w:rFonts w:ascii="Times New Roman" w:hAnsi="Times New Roman" w:cs="Times New Roman"/>
-          <w:sz w:val="28"/>
-          <w:szCs w:val="32"/>
-        </w:rPr>
-        <w:t xml:space="preserve">, </w:t>
-      </w:r>
-      <w:r>
-        <w:rPr>
-          <w:rFonts w:ascii="Times New Roman" w:hAnsi="Times New Roman" w:cs="Times New Roman"/>
+        </w:rPr>
+        <w:t xml:space="preserve">&lt;Link Doct.Date&gt;</w:t>
+      </w:r>
+      <w:r>
+        <w:t xml:space="preserve">, issued by the concerned Local Authority, </w:t>
+      </w:r>
+      <w:r>
+        <w:rPr>
           <w:b/>
-          <w:bCs/>
-          <w:sz w:val="28"/>
-          <w:szCs w:val="28"/>
-        </w:rPr>
-        <w:t xml:space="preserve">&lt;Village&gt; </w:t>
-      </w:r>
-      <w:r>
-        <w:rPr>
-          <w:rFonts w:ascii="Times New Roman" w:hAnsi="Times New Roman" w:cs="Times New Roman"/>
-          <w:sz w:val="28"/>
-          <w:szCs w:val="28"/>
-        </w:rPr>
-        <w:t>standing in respect of the Schedule Property.</w:t>
-      </w:r>
-      <w:r>
-        <w:rPr>
-          <w:rFonts w:ascii="Times New Roman" w:hAnsi="Times New Roman" w:cs="Times New Roman"/>
-          <w:sz w:val="28"/>
-          <w:szCs w:val="32"/>
-        </w:rPr>
-        <w:t xml:space="preserve"> </w:t>
+        </w:rPr>
+        <w:t xml:space="preserve">&lt;Village&gt;</w:t>
+      </w:r>
+      <w:r>
+        <w:t xml:space="preserve">, standing in respect of the Schedule Property.</w:t>
       </w:r>
     </w:p>
     <w:p>
@@ -2692,89 +2202,17 @@
       <w:r>
         <w:rPr>
           <w:b/>
-          <w:bCs/>
-          <w:sz w:val="28"/>
-          <w:szCs w:val="28"/>
-        </w:rPr>
-        <w:t>Tax/Assessment &amp; Identification Particulars</w:t>
-      </w:r>
-      <w:r>
-        <w:rPr>
-          <w:rStyle w:val="Strong"/>
-          <w:b w:val="0"/>
-          <w:bCs w:val="0"/>
-          <w:sz w:val="28"/>
-          <w:szCs w:val="28"/>
-        </w:rPr>
-        <w:t>:</w:t>
-      </w:r>
-      <w:r>
-        <w:rPr>
-          <w:sz w:val="28"/>
-          <w:szCs w:val="28"/>
-        </w:rPr>
-        <w:t xml:space="preserve"> The Schedule Property is duly identified in the records of the concerned Local Authority/Competent Authority under </w:t>
-      </w:r>
-      <w:r>
-        <w:rPr>
-          <w:rStyle w:val="Strong"/>
-          <w:b w:val="0"/>
-          <w:bCs w:val="0"/>
-          <w:sz w:val="28"/>
-          <w:szCs w:val="28"/>
-        </w:rPr>
-        <w:t>Assessment No</w:t>
-      </w:r>
-      <w:proofErr w:type="gramStart"/>
-      <w:r>
-        <w:rPr>
-          <w:rStyle w:val="Strong"/>
-          <w:b w:val="0"/>
-          <w:bCs w:val="0"/>
-          <w:sz w:val="28"/>
-          <w:szCs w:val="28"/>
-        </w:rPr>
-        <w:t>.</w:t>
-      </w:r>
-      <w:r>
-        <w:rPr>
-          <w:rStyle w:val="Strong"/>
-          <w:sz w:val="28"/>
-          <w:szCs w:val="28"/>
-        </w:rPr>
-        <w:t>&lt;</w:t>
-      </w:r>
-      <w:proofErr w:type="gramEnd"/>
-      <w:r>
-        <w:rPr>
-          <w:rStyle w:val="Strong"/>
-          <w:sz w:val="28"/>
-          <w:szCs w:val="28"/>
-        </w:rPr>
-        <w:t>P.T.I.</w:t>
-      </w:r>
-      <w:r>
-        <w:rPr>
-          <w:rStyle w:val="Strong"/>
-          <w:sz w:val="28"/>
-          <w:szCs w:val="28"/>
-        </w:rPr>
-        <w:t xml:space="preserve"> </w:t>
-      </w:r>
-      <w:r>
-        <w:rPr>
-          <w:rStyle w:val="Strong"/>
-          <w:sz w:val="28"/>
-          <w:szCs w:val="28"/>
-        </w:rPr>
-        <w:t>No.&gt;</w:t>
-      </w:r>
-      <w:r>
-        <w:rPr>
-          <w:sz w:val="28"/>
-          <w:szCs w:val="28"/>
-        </w:rPr>
-        <w:t>.</w:t>
+        </w:rPr>
+        <w:t xml:space="preserve">Tax/Assessment &amp; Identification Particulars: The Schedule Property is duly identified in the records of the concerned Local Authority/Competent Authority under Assessment No. </w:t>
+      </w:r>
+      <w:r>
+        <w:rPr>
+          <w:b/>
+        </w:rPr>
+        <w:t xml:space="preserve">&lt;P.T.I. No.&gt;</w:t>
+      </w:r>
+      <w:r>
+        <w:t xml:space="preserve">.</w:t>
       </w:r>
     </w:p>
     <w:p>
@@ -2794,81 +2232,36 @@
       </w:pPr>
       <w:r>
         <w:rPr>
-          <w:rStyle w:val="Strong"/>
-          <w:sz w:val="28"/>
-          <w:szCs w:val="28"/>
-        </w:rPr>
-        <w:t>House Permission:</w:t>
-      </w:r>
-      <w:r>
-        <w:rPr>
-          <w:sz w:val="28"/>
-          <w:szCs w:val="28"/>
-        </w:rPr>
-        <w:t xml:space="preserve"> The Schedule Property is covered by House Permission No. </w:t>
-      </w:r>
-      <w:r>
-        <w:rPr>
-          <w:rStyle w:val="Strong"/>
-          <w:sz w:val="28"/>
-          <w:szCs w:val="28"/>
-        </w:rPr>
-        <w:t>&lt;House Permission No.&gt;</w:t>
-      </w:r>
-      <w:r>
-        <w:rPr>
-          <w:sz w:val="28"/>
-          <w:szCs w:val="28"/>
-        </w:rPr>
+          <w:b/>
+        </w:rPr>
+        <w:t xml:space="preserve">House Permission: The Schedule Property is covered by House Permission No. </w:t>
+      </w:r>
+      <w:r>
+        <w:rPr>
+          <w:b/>
+        </w:rPr>
+        <w:t xml:space="preserve">&lt;House Permission No.&gt;</w:t>
+      </w:r>
+      <w:r>
         <w:t xml:space="preserve">, dated </w:t>
       </w:r>
       <w:r>
         <w:rPr>
-          <w:rStyle w:val="Strong"/>
-          <w:sz w:val="28"/>
-          <w:szCs w:val="28"/>
-        </w:rPr>
-        <w:t>&lt;Permission Date&gt;</w:t>
-      </w:r>
-      <w:r>
-        <w:rPr>
-          <w:sz w:val="28"/>
-          <w:szCs w:val="28"/>
-        </w:rPr>
+          <w:b/>
+        </w:rPr>
+        <w:t xml:space="preserve">&lt;Permission Date&gt;</w:t>
+      </w:r>
+      <w:r>
         <w:t xml:space="preserve">, issued by the concerned Local Authority, </w:t>
       </w:r>
       <w:r>
         <w:rPr>
-          <w:rStyle w:val="Strong"/>
-          <w:sz w:val="28"/>
-          <w:szCs w:val="28"/>
-        </w:rPr>
-        <w:t xml:space="preserve">&lt;Municipality/Gram </w:t>
-      </w:r>
-      <w:proofErr w:type="spellStart"/>
-      <w:r>
-        <w:rPr>
-          <w:rStyle w:val="Strong"/>
-          <w:sz w:val="28"/>
-          <w:szCs w:val="28"/>
-        </w:rPr>
-        <w:t>Panchayat</w:t>
-      </w:r>
-      <w:proofErr w:type="spellEnd"/>
-      <w:r>
-        <w:rPr>
-          <w:rStyle w:val="Strong"/>
-          <w:sz w:val="28"/>
-          <w:szCs w:val="28"/>
-        </w:rPr>
-        <w:t xml:space="preserve"> Name&gt;</w:t>
-      </w:r>
-      <w:r>
-        <w:rPr>
-          <w:sz w:val="28"/>
-          <w:szCs w:val="28"/>
-        </w:rPr>
-        <w:t>, in respect of the construction of the house situated on the Schedule Property.</w:t>
+          <w:b/>
+        </w:rPr>
+        <w:t xml:space="preserve">&lt;Municipality/Gram Panchayat Name&gt;</w:t>
+      </w:r>
+      <w:r>
+        <w:t xml:space="preserve">, in respect of the construction of the house situated on the Schedule Property.</w:t>
       </w:r>
     </w:p>
     <w:p>
@@ -2888,101 +2281,27 @@
       </w:pPr>
       <w:r>
         <w:rPr>
-          <w:rStyle w:val="Strong"/>
-          <w:sz w:val="28"/>
-          <w:szCs w:val="28"/>
-        </w:rPr>
-        <w:t xml:space="preserve">L.R.S.-2020 </w:t>
-      </w:r>
-      <w:proofErr w:type="spellStart"/>
-      <w:r>
-        <w:rPr>
-          <w:rStyle w:val="Strong"/>
-          <w:sz w:val="28"/>
-          <w:szCs w:val="28"/>
-        </w:rPr>
-        <w:t>Application</w:t>
-      </w:r>
-      <w:proofErr w:type="gramStart"/>
-      <w:r>
-        <w:rPr>
-          <w:rStyle w:val="Strong"/>
-          <w:sz w:val="28"/>
-          <w:szCs w:val="28"/>
-        </w:rPr>
-        <w:t>:</w:t>
-      </w:r>
-      <w:r>
-        <w:rPr>
-          <w:sz w:val="28"/>
-          <w:szCs w:val="28"/>
-        </w:rPr>
-        <w:t>The</w:t>
-      </w:r>
-      <w:proofErr w:type="spellEnd"/>
-      <w:proofErr w:type="gramEnd"/>
-      <w:r>
-        <w:rPr>
-          <w:sz w:val="28"/>
-          <w:szCs w:val="28"/>
-        </w:rPr>
-        <w:t xml:space="preserve"> Schedule Property has been submitted under the Layout </w:t>
-      </w:r>
-      <w:proofErr w:type="spellStart"/>
-      <w:r>
-        <w:rPr>
-          <w:sz w:val="28"/>
-          <w:szCs w:val="28"/>
-        </w:rPr>
-        <w:t>Regularisation</w:t>
-      </w:r>
-      <w:proofErr w:type="spellEnd"/>
-      <w:r>
-        <w:rPr>
-          <w:sz w:val="28"/>
-          <w:szCs w:val="28"/>
-        </w:rPr>
-        <w:t xml:space="preserve"> Scheme, 2020, vide </w:t>
-      </w:r>
-      <w:r>
-        <w:rPr>
-          <w:rStyle w:val="Strong"/>
-          <w:b w:val="0"/>
-          <w:bCs w:val="0"/>
-          <w:sz w:val="28"/>
-          <w:szCs w:val="28"/>
-        </w:rPr>
-        <w:t>L.R.S. Application No.</w:t>
-      </w:r>
-      <w:r>
-        <w:rPr>
-          <w:rStyle w:val="Strong"/>
-          <w:sz w:val="28"/>
-          <w:szCs w:val="28"/>
-        </w:rPr>
-        <w:t xml:space="preserve"> &lt;LRS Application No.&gt;</w:t>
-      </w:r>
-      <w:r>
-        <w:rPr>
-          <w:sz w:val="28"/>
-          <w:szCs w:val="28"/>
-        </w:rPr>
+          <w:b/>
+        </w:rPr>
+        <w:t xml:space="preserve">L.R.S.-2020 Application: The Schedule Property has been submitted under the Layout Regularisation Scheme, 2020, vide L.R.S. Application No. </w:t>
+      </w:r>
+      <w:r>
+        <w:rPr>
+          <w:b/>
+        </w:rPr>
+        <w:t xml:space="preserve">&lt;LRS Application No.&gt;</w:t>
+      </w:r>
+      <w:r>
         <w:t xml:space="preserve">, dated </w:t>
       </w:r>
       <w:r>
         <w:rPr>
-          <w:rStyle w:val="Strong"/>
-          <w:sz w:val="28"/>
-          <w:szCs w:val="28"/>
-        </w:rPr>
-        <w:t>&lt;Application Date&gt;</w:t>
-      </w:r>
-      <w:r>
-        <w:rPr>
-          <w:sz w:val="28"/>
-          <w:szCs w:val="28"/>
-        </w:rPr>
-        <w:t>.</w:t>
+          <w:b/>
+        </w:rPr>
+        <w:t xml:space="preserve">&lt;Application Date&gt;</w:t>
+      </w:r>
+      <w:r>
+        <w:t xml:space="preserve">.</w:t>
       </w:r>
     </w:p>
     <w:p>
@@ -3002,58 +2321,27 @@
       </w:pPr>
       <w:r>
         <w:rPr>
-          <w:rStyle w:val="Strong"/>
-          <w:sz w:val="28"/>
-          <w:szCs w:val="28"/>
-        </w:rPr>
-        <w:t xml:space="preserve">L.R.S. Proceeding: </w:t>
-      </w:r>
-      <w:r>
-        <w:rPr>
-          <w:sz w:val="28"/>
-          <w:szCs w:val="28"/>
-        </w:rPr>
-        <w:t xml:space="preserve">The Schedule Property is covered by </w:t>
-      </w:r>
-      <w:r>
-        <w:rPr>
-          <w:rStyle w:val="Strong"/>
-          <w:b w:val="0"/>
-          <w:bCs w:val="0"/>
-          <w:sz w:val="28"/>
-          <w:szCs w:val="28"/>
-        </w:rPr>
-        <w:t>L.R.S. Proceeding No.</w:t>
-      </w:r>
-      <w:r>
-        <w:rPr>
-          <w:rStyle w:val="Strong"/>
-          <w:sz w:val="28"/>
-          <w:szCs w:val="28"/>
-        </w:rPr>
-        <w:t xml:space="preserve"> &lt;LRS Proceeding No.&gt;</w:t>
-      </w:r>
-      <w:r>
-        <w:rPr>
-          <w:sz w:val="28"/>
-          <w:szCs w:val="28"/>
-        </w:rPr>
+          <w:b/>
+        </w:rPr>
+        <w:t xml:space="preserve">L.R.S. Proceeding: The Schedule Property is covered by L.R.S. Proceeding No. </w:t>
+      </w:r>
+      <w:r>
+        <w:rPr>
+          <w:b/>
+        </w:rPr>
+        <w:t xml:space="preserve">&lt;LRS Proceeding No.&gt;</w:t>
+      </w:r>
+      <w:r>
         <w:t xml:space="preserve">, dated </w:t>
       </w:r>
       <w:r>
         <w:rPr>
-          <w:rStyle w:val="Strong"/>
-          <w:sz w:val="28"/>
-          <w:szCs w:val="28"/>
-        </w:rPr>
-        <w:t>&lt;Proceeding Date&gt;</w:t>
-      </w:r>
-      <w:r>
-        <w:rPr>
-          <w:sz w:val="28"/>
-          <w:szCs w:val="28"/>
-        </w:rPr>
-        <w:t>, issued by the Competent Authority.</w:t>
+          <w:b/>
+        </w:rPr>
+        <w:t xml:space="preserve">&lt;Proceeding Date&gt;</w:t>
+      </w:r>
+      <w:r>
+        <w:t xml:space="preserve">, issued by the Competent Authority.</w:t>
       </w:r>
     </w:p>
     <w:p>

</xml_diff>